<commit_message>
Update Week5 python project report documents
</commit_message>
<xml_diff>
--- a/3rdSem/PROJECTS/PYTHON/documentations/docx/Week5_(print 1,3,4,6 pages)_Encryption_Tool_and_Word_Frequency_Counter_Report.docx
+++ b/3rdSem/PROJECTS/PYTHON/documentations/docx/Week5_(print 1,3,4,6 pages)_Encryption_Tool_and_Word_Frequency_Counter_Report.docx
@@ -63,7 +63,7 @@
     </w:p>
     <w:tbl>
       <w:tblPr>
-        <w:tblW w:w="9400" w:type="dxa"/>
+        <w:tblW w:w="9729" w:type="dxa"/>
         <w:tblBorders>
           <w:top w:val="single" w:sz="4" w:space="0" w:color="auto"/>
           <w:left w:val="single" w:sz="4" w:space="0" w:color="auto"/>
@@ -79,13 +79,16 @@
         <w:tblLook w:val="0000" w:firstRow="0" w:lastRow="0" w:firstColumn="0" w:lastColumn="0" w:noHBand="0" w:noVBand="0"/>
       </w:tblPr>
       <w:tblGrid>
-        <w:gridCol w:w="2600"/>
-        <w:gridCol w:w="6800"/>
+        <w:gridCol w:w="2691"/>
+        <w:gridCol w:w="7038"/>
       </w:tblGrid>
       <w:tr>
+        <w:trPr>
+          <w:trHeight w:val="532"/>
+        </w:trPr>
         <w:tc>
           <w:tcPr>
-            <w:tcW w:w="2600" w:type="dxa"/>
+            <w:tcW w:w="2691" w:type="dxa"/>
             <w:tcBorders>
               <w:top w:val="single" w:sz="4" w:space="0" w:color="9DB6CE"/>
               <w:left w:val="single" w:sz="4" w:space="0" w:color="9DB6CE"/>
@@ -116,7 +119,7 @@
         </w:tc>
         <w:tc>
           <w:tcPr>
-            <w:tcW w:w="6800" w:type="dxa"/>
+            <w:tcW w:w="7038" w:type="dxa"/>
             <w:tcBorders>
               <w:top w:val="single" w:sz="4" w:space="0" w:color="9DB6CE"/>
               <w:left w:val="single" w:sz="4" w:space="0" w:color="9DB6CE"/>
@@ -139,48 +142,18 @@
                 <w:sz w:val="21"/>
                 <w:szCs w:val="21"/>
               </w:rPr>
-              <w:t>Password Strength Checker &amp; Email Validation System</w:t>
-            </w:r>
-            <w:r>
-              <w:rPr>
-                <w:b/>
-                <w:bCs/>
-                <w:sz w:val="21"/>
-                <w:szCs w:val="21"/>
-              </w:rPr>
-              <w:t xml:space="preserve"> </w:t>
-            </w:r>
-            <w:r>
-              <w:rPr>
-                <w:b/>
-                <w:bCs/>
-                <w:color w:val="404040"/>
-              </w:rPr>
-              <w:t xml:space="preserve">(Program </w:t>
-            </w:r>
-            <w:r>
-              <w:rPr>
-                <w:b/>
-                <w:bCs/>
-                <w:color w:val="404040"/>
-              </w:rPr>
-              <w:t xml:space="preserve">1 &amp; </w:t>
-            </w:r>
-            <w:r>
-              <w:rPr>
-                <w:b/>
-                <w:bCs/>
-                <w:color w:val="404040"/>
-              </w:rPr>
-              <w:t>2)</w:t>
+              <w:t>Text Encryption &amp; Decryption Tool and Word Frequency Counter (Program 1 &amp; 2)</w:t>
             </w:r>
           </w:p>
         </w:tc>
       </w:tr>
       <w:tr>
+        <w:trPr>
+          <w:trHeight w:val="1348"/>
+        </w:trPr>
         <w:tc>
           <w:tcPr>
-            <w:tcW w:w="2600" w:type="dxa"/>
+            <w:tcW w:w="2691" w:type="dxa"/>
             <w:tcBorders>
               <w:top w:val="single" w:sz="4" w:space="0" w:color="9DB6CE"/>
               <w:left w:val="single" w:sz="4" w:space="0" w:color="9DB6CE"/>
@@ -211,7 +184,7 @@
         </w:tc>
         <w:tc>
           <w:tcPr>
-            <w:tcW w:w="6800" w:type="dxa"/>
+            <w:tcW w:w="7038" w:type="dxa"/>
             <w:tcBorders>
               <w:top w:val="single" w:sz="4" w:space="0" w:color="9DB6CE"/>
               <w:left w:val="single" w:sz="4" w:space="0" w:color="9DB6CE"/>
@@ -334,9 +307,12 @@
         </w:tc>
       </w:tr>
       <w:tr>
+        <w:trPr>
+          <w:trHeight w:val="266"/>
+        </w:trPr>
         <w:tc>
           <w:tcPr>
-            <w:tcW w:w="2600" w:type="dxa"/>
+            <w:tcW w:w="2691" w:type="dxa"/>
             <w:tcBorders>
               <w:top w:val="single" w:sz="4" w:space="0" w:color="9DB6CE"/>
               <w:left w:val="single" w:sz="4" w:space="0" w:color="9DB6CE"/>
@@ -367,7 +343,7 @@
         </w:tc>
         <w:tc>
           <w:tcPr>
-            <w:tcW w:w="6800" w:type="dxa"/>
+            <w:tcW w:w="7038" w:type="dxa"/>
             <w:tcBorders>
               <w:top w:val="single" w:sz="4" w:space="0" w:color="9DB6CE"/>
               <w:left w:val="single" w:sz="4" w:space="0" w:color="9DB6CE"/>
@@ -409,9 +385,12 @@
         </w:tc>
       </w:tr>
       <w:tr>
+        <w:trPr>
+          <w:trHeight w:val="266"/>
+        </w:trPr>
         <w:tc>
           <w:tcPr>
-            <w:tcW w:w="2600" w:type="dxa"/>
+            <w:tcW w:w="2691" w:type="dxa"/>
             <w:tcBorders>
               <w:top w:val="single" w:sz="4" w:space="0" w:color="9DB6CE"/>
               <w:left w:val="single" w:sz="4" w:space="0" w:color="9DB6CE"/>
@@ -442,7 +421,7 @@
         </w:tc>
         <w:tc>
           <w:tcPr>
-            <w:tcW w:w="6800" w:type="dxa"/>
+            <w:tcW w:w="7038" w:type="dxa"/>
             <w:tcBorders>
               <w:top w:val="single" w:sz="4" w:space="0" w:color="9DB6CE"/>
               <w:left w:val="single" w:sz="4" w:space="0" w:color="9DB6CE"/>
@@ -498,9 +477,12 @@
         </w:tc>
       </w:tr>
       <w:tr>
+        <w:trPr>
+          <w:trHeight w:val="532"/>
+        </w:trPr>
         <w:tc>
           <w:tcPr>
-            <w:tcW w:w="2600" w:type="dxa"/>
+            <w:tcW w:w="2691" w:type="dxa"/>
             <w:tcBorders>
               <w:top w:val="single" w:sz="4" w:space="0" w:color="9DB6CE"/>
               <w:left w:val="single" w:sz="4" w:space="0" w:color="9DB6CE"/>
@@ -531,7 +513,7 @@
         </w:tc>
         <w:tc>
           <w:tcPr>
-            <w:tcW w:w="6800" w:type="dxa"/>
+            <w:tcW w:w="7038" w:type="dxa"/>
             <w:tcBorders>
               <w:top w:val="single" w:sz="4" w:space="0" w:color="9DB6CE"/>
               <w:left w:val="single" w:sz="4" w:space="0" w:color="9DB6CE"/>
@@ -560,9 +542,12 @@
         </w:tc>
       </w:tr>
       <w:tr>
+        <w:trPr>
+          <w:trHeight w:val="282"/>
+        </w:trPr>
         <w:tc>
           <w:tcPr>
-            <w:tcW w:w="2600" w:type="dxa"/>
+            <w:tcW w:w="2691" w:type="dxa"/>
             <w:tcBorders>
               <w:top w:val="single" w:sz="4" w:space="0" w:color="9DB6CE"/>
               <w:left w:val="single" w:sz="4" w:space="0" w:color="9DB6CE"/>
@@ -602,7 +587,7 @@
         </w:tc>
         <w:tc>
           <w:tcPr>
-            <w:tcW w:w="6800" w:type="dxa"/>
+            <w:tcW w:w="7038" w:type="dxa"/>
             <w:tcBorders>
               <w:top w:val="single" w:sz="4" w:space="0" w:color="9DB6CE"/>
               <w:left w:val="single" w:sz="4" w:space="0" w:color="9DB6CE"/>
@@ -642,7 +627,25 @@
                 <w:sz w:val="21"/>
                 <w:szCs w:val="21"/>
               </w:rPr>
-              <w:t>/07/2026</w:t>
+              <w:t>/0</w:t>
+            </w:r>
+            <w:r>
+              <w:rPr>
+                <w:b/>
+                <w:bCs/>
+                <w:sz w:val="21"/>
+                <w:szCs w:val="21"/>
+              </w:rPr>
+              <w:t>8</w:t>
+            </w:r>
+            <w:r>
+              <w:rPr>
+                <w:b/>
+                <w:bCs/>
+                <w:sz w:val="21"/>
+                <w:szCs w:val="21"/>
+              </w:rPr>
+              <w:t>/2026</w:t>
             </w:r>
           </w:p>
         </w:tc>

</xml_diff>